<commit_message>
Actualiza el Checklist Antidevolucion con la portada y contraportada disenadas
Co-Authored-By: Claude Opus 5.5 <noreply@anthropic.com>
Claude-Session: https://claude.ai/code/session_01TB3CbPgKxJ1LHhHYHoBfPs
</commit_message>
<xml_diff>
--- a/descargas/74c354a7998810092c604281/Checklist-Antidevolucion-TesisLab.docx
+++ b/descargas/74c354a7998810092c604281/Checklist-Antidevolucion-TesisLab.docx
@@ -4,117 +4,67 @@
   <w:body>
     <w:p>
       <w:pPr>
-        <w:spacing w:after="400" w:before="1800" w:line="276" w:lineRule="auto"/>
+        <w:spacing w:after="0" w:before="0" w:line="240"/>
       </w:pPr>
       <w:r>
-        <w:rPr>
-          <w:rFonts w:ascii="Montserrat" w:cs="Montserrat" w:eastAsia="Montserrat" w:hAnsi="Montserrat"/>
-          <w:b/>
-          <w:bCs/>
-          <w:color w:val="C9A64C"/>
-          <w:sz w:val="22"/>
-          <w:szCs w:val="22"/>
-        </w:rPr>
-        <w:t xml:space="preserve">TESISLAB EXPERTOS</w:t>
+        <w:drawing>
+          <wp:anchor distT="0" distB="0" distL="0" distR="0" simplePos="0" allowOverlap="1" behindDoc="1" locked="1" layoutInCell="1" relativeHeight="8229600">
+            <wp:simplePos x="0" y="0"/>
+            <wp:positionH relativeFrom="page">
+              <wp:posOffset>0</wp:posOffset>
+            </wp:positionH>
+            <wp:positionV relativeFrom="page">
+              <wp:posOffset>0</wp:posOffset>
+            </wp:positionV>
+            <wp:extent cx="5486400" cy="8229600"/>
+            <wp:effectExtent t="0" r="0" b="0" l="0"/>
+            <wp:wrapNone/>
+            <wp:docPr id="1" name="" descr="" title=""/>
+            <wp:cNvGraphicFramePr>
+              <a:graphicFrameLocks xmlns:a="http://schemas.openxmlformats.org/drawingml/2006/main" noChangeAspect="1"/>
+            </wp:cNvGraphicFramePr>
+            <a:graphic xmlns:a="http://schemas.openxmlformats.org/drawingml/2006/main">
+              <a:graphicData uri="http://schemas.openxmlformats.org/drawingml/2006/picture">
+                <pic:pic xmlns:pic="http://schemas.openxmlformats.org/drawingml/2006/picture">
+                  <pic:nvPicPr>
+                    <pic:cNvPr id="0" name="" descr=""/>
+                    <pic:cNvPicPr>
+                      <a:picLocks noChangeAspect="1" noChangeArrowheads="1"/>
+                    </pic:cNvPicPr>
+                  </pic:nvPicPr>
+                  <pic:blipFill>
+                    <a:blip r:embed="rId10" cstate="none"/>
+                    <a:srcRect/>
+                    <a:stretch>
+                      <a:fillRect/>
+                    </a:stretch>
+                  </pic:blipFill>
+                  <pic:spPr bwMode="auto">
+                    <a:xfrm>
+                      <a:off x="0" y="0"/>
+                      <a:ext cx="5486400" cy="8229600"/>
+                    </a:xfrm>
+                    <a:prstGeom prst="rect">
+                      <a:avLst/>
+                    </a:prstGeom>
+                  </pic:spPr>
+                </pic:pic>
+              </a:graphicData>
+            </a:graphic>
+          </wp:anchor>
+        </w:drawing>
       </w:r>
     </w:p>
     <w:p>
       <w:pPr>
-        <w:spacing w:after="0" w:before="0" w:line="900" w:lineRule="exact"/>
+        <w:sectPr>
+          <w:footerReference w:type="default" r:id="rId6"/>
+          <w:pgSz w:w="8640" w:h="12960" w:orient="portrait"/>
+          <w:pgMar w:top="0" w:right="0" w:bottom="0" w:left="0" w:header="0" w:footer="0" w:gutter="0"/>
+          <w:pgNumType/>
+          <w:docGrid w:linePitch="360"/>
+        </w:sectPr>
       </w:pPr>
-      <w:r>
-        <w:rPr>
-          <w:rFonts w:ascii="Montserrat" w:cs="Montserrat" w:eastAsia="Montserrat" w:hAnsi="Montserrat"/>
-          <w:b/>
-          <w:bCs/>
-          <w:color w:val="1A2A4F"/>
-          <w:sz w:val="72"/>
-          <w:szCs w:val="72"/>
-        </w:rPr>
-        <w:t xml:space="preserve">Checklist</w:t>
-      </w:r>
-    </w:p>
-    <w:p>
-      <w:pPr>
-        <w:pBdr>
-          <w:bottom w:val="single" w:color="C9A64C" w:sz="12" w:space="6"/>
-        </w:pBdr>
-        <w:spacing w:after="240" w:before="0" w:line="900" w:lineRule="exact"/>
-      </w:pPr>
-      <w:r>
-        <w:rPr>
-          <w:rFonts w:ascii="Montserrat" w:cs="Montserrat" w:eastAsia="Montserrat" w:hAnsi="Montserrat"/>
-          <w:b/>
-          <w:bCs/>
-          <w:color w:val="1A2A4F"/>
-          <w:sz w:val="72"/>
-          <w:szCs w:val="72"/>
-        </w:rPr>
-        <w:t xml:space="preserve">Antidevolución</w:t>
-      </w:r>
-    </w:p>
-    <w:p>
-      <w:pPr>
-        <w:spacing w:after="1600" w:before="240" w:line="276" w:lineRule="auto"/>
-      </w:pPr>
-      <w:r>
-        <w:rPr>
-          <w:rFonts w:ascii="Montserrat" w:cs="Montserrat" w:eastAsia="Montserrat" w:hAnsi="Montserrat"/>
-          <w:color w:val="5A5A5A"/>
-          <w:sz w:val="30"/>
-          <w:szCs w:val="30"/>
-        </w:rPr>
-        <w:t xml:space="preserve">50 puntos que revisan asesores y jurados antes de aprobar tu tesis</w:t>
-      </w:r>
-    </w:p>
-    <w:p>
-      <w:pPr>
-        <w:spacing w:after="80" w:before="0" w:line="276" w:lineRule="auto"/>
-      </w:pPr>
-      <w:r>
-        <w:rPr>
-          <w:rFonts w:ascii="Calibri" w:cs="Calibri" w:eastAsia="Calibri" w:hAnsi="Calibri"/>
-          <w:color w:val="5A5A5A"/>
-          <w:sz w:val="24"/>
-          <w:szCs w:val="24"/>
-        </w:rPr>
-        <w:t xml:space="preserve">Para estudiantes de licenciatura, maestría y doctorado</w:t>
-      </w:r>
-    </w:p>
-    <w:p>
-      <w:pPr>
-        <w:spacing w:after="80" w:before="0" w:line="276" w:lineRule="auto"/>
-      </w:pPr>
-      <w:r>
-        <w:rPr>
-          <w:rFonts w:ascii="Calibri" w:cs="Calibri" w:eastAsia="Calibri" w:hAnsi="Calibri"/>
-          <w:color w:val="5A5A5A"/>
-          <w:sz w:val="24"/>
-          <w:szCs w:val="24"/>
-        </w:rPr>
-        <w:t xml:space="preserve">Asesoría de tesis en Panamá</w:t>
-      </w:r>
-    </w:p>
-    <w:p>
-      <w:pPr>
-        <w:spacing w:after="0" w:before="0" w:line="276" w:lineRule="auto"/>
-      </w:pPr>
-      <w:r>
-        <w:rPr>
-          <w:rFonts w:ascii="Calibri" w:cs="Calibri" w:eastAsia="Calibri" w:hAnsi="Calibri"/>
-          <w:b/>
-          <w:bCs/>
-          <w:color w:val="1A2A4F"/>
-          <w:sz w:val="24"/>
-          <w:szCs w:val="24"/>
-        </w:rPr>
-        <w:t xml:space="preserve">tesislabexpertos.com</w:t>
-      </w:r>
-    </w:p>
-    <w:p>
-      <w:r>
-        <w:br w:type="page"/>
-      </w:r>
     </w:p>
     <w:p>
       <w:pPr>
@@ -7115,7 +7065,7 @@
         </w:rPr>
         <w:t xml:space="preserve">WhatsApp: </w:t>
       </w:r>
-      <w:hyperlink w:history="1" r:id="rIdgfs2ehqfimnracrbir8wt">
+      <w:hyperlink w:history="1" r:id="rIdoq8uu5qbzhmzje7rmthaq">
         <w:r>
           <w:rPr>
             <w:rFonts w:ascii="Calibri" w:cs="Calibri" w:eastAsia="Calibri" w:hAnsi="Calibri"/>
@@ -7145,7 +7095,7 @@
         </w:rPr>
         <w:t xml:space="preserve">Sitio web: </w:t>
       </w:r>
-      <w:hyperlink w:history="1" r:id="rIdyvh4xyrql9rgy_qhozf5f">
+      <w:hyperlink w:history="1" r:id="rIdcz8f0w5rmplfsymkgdo6e">
         <w:r>
           <w:rPr>
             <w:rFonts w:ascii="Calibri" w:cs="Calibri" w:eastAsia="Calibri" w:hAnsi="Calibri"/>
@@ -7175,7 +7125,7 @@
         </w:rPr>
         <w:t xml:space="preserve">Correo: </w:t>
       </w:r>
-      <w:hyperlink w:history="1" r:id="rIdajqsofo-ii3mkofw8fctc">
+      <w:hyperlink w:history="1" r:id="rIdxma_y6wt24oyugjt_novf">
         <w:r>
           <w:rPr>
             <w:rFonts w:ascii="Calibri" w:cs="Calibri" w:eastAsia="Calibri" w:hAnsi="Calibri"/>
@@ -7205,7 +7155,7 @@
         </w:rPr>
         <w:t xml:space="preserve">Libro en Amazon: </w:t>
       </w:r>
-      <w:hyperlink w:history="1" r:id="rIdtvo8xzaqhxotnlblpfqim">
+      <w:hyperlink w:history="1" r:id="rIdo44eveh1-mr16iz9hxltd">
         <w:r>
           <w:rPr>
             <w:rFonts w:ascii="Calibri" w:cs="Calibri" w:eastAsia="Calibri" w:hAnsi="Calibri"/>
@@ -7236,13 +7186,77 @@
         <w:t xml:space="preserve">Material gratuito de TesisLab Expertos para uso personal del estudiante. Se permite compartirlo sin modificaciones y sin fines comerciales.</w:t>
       </w:r>
     </w:p>
+    <w:p>
+      <w:pPr>
+        <w:sectPr>
+          <w:footerReference w:type="default" r:id="rId7"/>
+          <w:type w:val="nextPage"/>
+          <w:pgSz w:w="12240" w:h="15840" w:orient="portrait"/>
+          <w:pgMar w:top="1440" w:right="1440" w:bottom="1440" w:left="1440" w:header="708" w:footer="708" w:gutter="0"/>
+          <w:pgNumType w:start="1"/>
+          <w:docGrid w:linePitch="360"/>
+        </w:sectPr>
+      </w:pPr>
+    </w:p>
+    <w:p>
+      <w:pPr>
+        <w:spacing w:after="0" w:before="0" w:line="240"/>
+      </w:pPr>
+      <w:r>
+        <w:drawing>
+          <wp:anchor distT="0" distB="0" distL="0" distR="0" simplePos="0" allowOverlap="1" behindDoc="1" locked="1" layoutInCell="1" relativeHeight="8229600">
+            <wp:simplePos x="0" y="0"/>
+            <wp:positionH relativeFrom="page">
+              <wp:posOffset>0</wp:posOffset>
+            </wp:positionH>
+            <wp:positionV relativeFrom="page">
+              <wp:posOffset>0</wp:posOffset>
+            </wp:positionV>
+            <wp:extent cx="5486400" cy="8229600"/>
+            <wp:effectExtent t="0" r="0" b="0" l="0"/>
+            <wp:wrapNone/>
+            <wp:docPr id="2" name="" descr="" title=""/>
+            <wp:cNvGraphicFramePr>
+              <a:graphicFrameLocks xmlns:a="http://schemas.openxmlformats.org/drawingml/2006/main" noChangeAspect="1"/>
+            </wp:cNvGraphicFramePr>
+            <a:graphic xmlns:a="http://schemas.openxmlformats.org/drawingml/2006/main">
+              <a:graphicData uri="http://schemas.openxmlformats.org/drawingml/2006/picture">
+                <pic:pic xmlns:pic="http://schemas.openxmlformats.org/drawingml/2006/picture">
+                  <pic:nvPicPr>
+                    <pic:cNvPr id="0" name="" descr=""/>
+                    <pic:cNvPicPr>
+                      <a:picLocks noChangeAspect="1" noChangeArrowheads="1"/>
+                    </pic:cNvPicPr>
+                  </pic:nvPicPr>
+                  <pic:blipFill>
+                    <a:blip r:embed="rId11" cstate="none"/>
+                    <a:srcRect/>
+                    <a:stretch>
+                      <a:fillRect/>
+                    </a:stretch>
+                  </pic:blipFill>
+                  <pic:spPr bwMode="auto">
+                    <a:xfrm>
+                      <a:off x="0" y="0"/>
+                      <a:ext cx="5486400" cy="8229600"/>
+                    </a:xfrm>
+                    <a:prstGeom prst="rect">
+                      <a:avLst/>
+                    </a:prstGeom>
+                  </pic:spPr>
+                </pic:pic>
+              </a:graphicData>
+            </a:graphic>
+          </wp:anchor>
+        </w:drawing>
+      </w:r>
+    </w:p>
     <w:sectPr>
-      <w:footerReference w:type="default" r:id="rId6"/>
-      <w:footerReference w:type="first" r:id="rId7"/>
-      <w:pgSz w:w="12240" w:h="15840" w:orient="portrait"/>
-      <w:pgMar w:top="1440" w:right="1440" w:bottom="1440" w:left="1440" w:header="708" w:footer="708" w:gutter="0"/>
+      <w:footerReference w:type="default" r:id="rId8"/>
+      <w:type w:val="nextPage"/>
+      <w:pgSz w:w="8640" w:h="12960" w:orient="portrait"/>
+      <w:pgMar w:top="0" w:right="0" w:bottom="0" w:left="0" w:header="0" w:footer="0" w:gutter="0"/>
       <w:pgNumType/>
-      <w:titlePg/>
       <w:docGrid w:linePitch="360"/>
     </w:sectPr>
   </w:body>
@@ -7289,6 +7303,16 @@
 <file path=word/footer1.xml><?xml version="1.0" encoding="utf-8"?>
 <w:ftr xmlns:wpc="http://schemas.microsoft.com/office/word/2010/wordprocessingCanvas" xmlns:mc="http://schemas.openxmlformats.org/markup-compatibility/2006" xmlns:o="urn:schemas-microsoft-com:office:office" xmlns:r="http://schemas.openxmlformats.org/officeDocument/2006/relationships" xmlns:m="http://schemas.openxmlformats.org/officeDocument/2006/math" xmlns:v="urn:schemas-microsoft-com:vml" xmlns:wp14="http://schemas.microsoft.com/office/word/2010/wordprocessingDrawing" xmlns:wp="http://schemas.openxmlformats.org/drawingml/2006/wordprocessingDrawing" xmlns:w10="urn:schemas-microsoft-com:office:word" xmlns:w="http://schemas.openxmlformats.org/wordprocessingml/2006/main" xmlns:w14="http://schemas.microsoft.com/office/word/2010/wordml" xmlns:w15="http://schemas.microsoft.com/office/word/2012/wordml" xmlns:wpg="http://schemas.microsoft.com/office/word/2010/wordprocessingGroup" xmlns:wpi="http://schemas.microsoft.com/office/word/2010/wordprocessingInk" xmlns:wne="http://schemas.microsoft.com/office/word/2006/wordml" xmlns:wps="http://schemas.microsoft.com/office/word/2010/wordprocessingShape">
   <w:p>
+    <w:r>
+      <w:t xml:space="preserve"/>
+    </w:r>
+  </w:p>
+</w:ftr>
+</file>
+
+<file path=word/footer2.xml><?xml version="1.0" encoding="utf-8"?>
+<w:ftr xmlns:wpc="http://schemas.microsoft.com/office/word/2010/wordprocessingCanvas" xmlns:mc="http://schemas.openxmlformats.org/markup-compatibility/2006" xmlns:o="urn:schemas-microsoft-com:office:office" xmlns:r="http://schemas.openxmlformats.org/officeDocument/2006/relationships" xmlns:m="http://schemas.openxmlformats.org/officeDocument/2006/math" xmlns:v="urn:schemas-microsoft-com:vml" xmlns:wp14="http://schemas.microsoft.com/office/word/2010/wordprocessingDrawing" xmlns:wp="http://schemas.openxmlformats.org/drawingml/2006/wordprocessingDrawing" xmlns:w10="urn:schemas-microsoft-com:office:word" xmlns:w="http://schemas.openxmlformats.org/wordprocessingml/2006/main" xmlns:w14="http://schemas.microsoft.com/office/word/2010/wordml" xmlns:w15="http://schemas.microsoft.com/office/word/2012/wordml" xmlns:wpg="http://schemas.microsoft.com/office/word/2010/wordprocessingGroup" xmlns:wpi="http://schemas.microsoft.com/office/word/2010/wordprocessingInk" xmlns:wne="http://schemas.microsoft.com/office/word/2006/wordml" xmlns:wps="http://schemas.microsoft.com/office/word/2010/wordprocessingShape">
+  <w:p>
     <w:pPr>
       <w:jc w:val="center"/>
     </w:pPr>
@@ -7317,7 +7341,7 @@
 </w:ftr>
 </file>
 
-<file path=word/footer2.xml><?xml version="1.0" encoding="utf-8"?>
+<file path=word/footer3.xml><?xml version="1.0" encoding="utf-8"?>
 <w:ftr xmlns:wpc="http://schemas.microsoft.com/office/word/2010/wordprocessingCanvas" xmlns:mc="http://schemas.openxmlformats.org/markup-compatibility/2006" xmlns:o="urn:schemas-microsoft-com:office:office" xmlns:r="http://schemas.openxmlformats.org/officeDocument/2006/relationships" xmlns:m="http://schemas.openxmlformats.org/officeDocument/2006/math" xmlns:v="urn:schemas-microsoft-com:vml" xmlns:wp14="http://schemas.microsoft.com/office/word/2010/wordprocessingDrawing" xmlns:wp="http://schemas.openxmlformats.org/drawingml/2006/wordprocessingDrawing" xmlns:w10="urn:schemas-microsoft-com:office:word" xmlns:w="http://schemas.openxmlformats.org/wordprocessingml/2006/main" xmlns:w14="http://schemas.microsoft.com/office/word/2010/wordml" xmlns:w15="http://schemas.microsoft.com/office/word/2012/wordml" xmlns:wpg="http://schemas.microsoft.com/office/word/2010/wordprocessingGroup" xmlns:wpi="http://schemas.microsoft.com/office/word/2010/wordprocessingInk" xmlns:wne="http://schemas.microsoft.com/office/word/2006/wordml" xmlns:wps="http://schemas.microsoft.com/office/word/2010/wordprocessingShape">
   <w:p>
     <w:r>

</xml_diff>

<commit_message>
Agrega codigo QR de enlaces en la contraportada del checklist
Co-Authored-By: Claude Opus 5.5 <noreply@anthropic.com>
Claude-Session: https://claude.ai/code/session_01TB3CbPgKxJ1LHhHYHoBfPs
</commit_message>
<xml_diff>
--- a/descargas/74c354a7998810092c604281/Checklist-Antidevolucion-TesisLab.docx
+++ b/descargas/74c354a7998810092c604281/Checklist-Antidevolucion-TesisLab.docx
@@ -7065,7 +7065,7 @@
         </w:rPr>
         <w:t xml:space="preserve">WhatsApp: </w:t>
       </w:r>
-      <w:hyperlink w:history="1" r:id="rIdoq8uu5qbzhmzje7rmthaq">
+      <w:hyperlink w:history="1" r:id="rIdwegsdcaqy3ew2mnubz4gi">
         <w:r>
           <w:rPr>
             <w:rFonts w:ascii="Calibri" w:cs="Calibri" w:eastAsia="Calibri" w:hAnsi="Calibri"/>
@@ -7095,7 +7095,7 @@
         </w:rPr>
         <w:t xml:space="preserve">Sitio web: </w:t>
       </w:r>
-      <w:hyperlink w:history="1" r:id="rIdcz8f0w5rmplfsymkgdo6e">
+      <w:hyperlink w:history="1" r:id="rIddesg2rzfz9mewkt4sfkfr">
         <w:r>
           <w:rPr>
             <w:rFonts w:ascii="Calibri" w:cs="Calibri" w:eastAsia="Calibri" w:hAnsi="Calibri"/>
@@ -7125,7 +7125,7 @@
         </w:rPr>
         <w:t xml:space="preserve">Correo: </w:t>
       </w:r>
-      <w:hyperlink w:history="1" r:id="rIdxma_y6wt24oyugjt_novf">
+      <w:hyperlink w:history="1" r:id="rIdcubf4fi7007lj5f8bzvxp">
         <w:r>
           <w:rPr>
             <w:rFonts w:ascii="Calibri" w:cs="Calibri" w:eastAsia="Calibri" w:hAnsi="Calibri"/>
@@ -7155,7 +7155,7 @@
         </w:rPr>
         <w:t xml:space="preserve">Libro en Amazon: </w:t>
       </w:r>
-      <w:hyperlink w:history="1" r:id="rIdo44eveh1-mr16iz9hxltd">
+      <w:hyperlink w:history="1" r:id="rIdqd-ydvg0f9tl5sezcb6_k">
         <w:r>
           <w:rPr>
             <w:rFonts w:ascii="Calibri" w:cs="Calibri" w:eastAsia="Calibri" w:hAnsi="Calibri"/>

</xml_diff>